<commit_message>
Add Dr. Elena Luchkina line to QR scan cards
Co-Authored-By: Claude Opus 4.8 <noreply@anthropic.com>
</commit_message>
<xml_diff>
--- a/ICIS2026_QR_Scan_Cards.docx
+++ b/ICIS2026_QR_Scan_Cards.docx
@@ -170,6 +170,22 @@
                 <w:sz w:val="32"/>
               </w:rPr>
               <w:t>————</w:t>
+            </w:r>
+          </w:p>
+          <w:p>
+            <w:pPr>
+              <w:spacing w:before="40" w:after="40"/>
+              <w:jc w:val="center"/>
+            </w:pPr>
+            <w:r>
+              <w:rPr>
+                <w:rFonts w:ascii="Arial" w:hAnsi="Arial"/>
+                <w:b/>
+                <w:i w:val="0"/>
+                <w:color w:val="154734"/>
+                <w:sz w:val="23"/>
+              </w:rPr>
+              <w:t>Research led by Dr. Elena Luchkina</w:t>
             </w:r>
           </w:p>
           <w:p>
@@ -364,6 +380,22 @@
                 <w:sz w:val="32"/>
               </w:rPr>
               <w:t>————</w:t>
+            </w:r>
+          </w:p>
+          <w:p>
+            <w:pPr>
+              <w:spacing w:before="40" w:after="40"/>
+              <w:jc w:val="center"/>
+            </w:pPr>
+            <w:r>
+              <w:rPr>
+                <w:rFonts w:ascii="Arial" w:hAnsi="Arial"/>
+                <w:b/>
+                <w:i w:val="0"/>
+                <w:color w:val="154734"/>
+                <w:sz w:val="23"/>
+              </w:rPr>
+              <w:t>Research led by Dr. Elena Luchkina</w:t>
             </w:r>
           </w:p>
           <w:p>

</xml_diff>

<commit_message>
QR cards: show full author list instead of single lead line
Co-Authored-By: Claude Opus 4.8 <noreply@anthropic.com>
</commit_message>
<xml_diff>
--- a/ICIS2026_QR_Scan_Cards.docx
+++ b/ICIS2026_QR_Scan_Cards.docx
@@ -185,7 +185,7 @@
                 <w:color w:val="154734"/>
                 <w:sz w:val="23"/>
               </w:rPr>
-              <w:t>Research led by Dr. Elena Luchkina</w:t>
+              <w:t>Elena Luchkina &amp; Elizabeth Spelke</w:t>
             </w:r>
           </w:p>
           <w:p>
@@ -395,7 +395,7 @@
                 <w:color w:val="154734"/>
                 <w:sz w:val="23"/>
               </w:rPr>
-              <w:t>Research led by Dr. Elena Luchkina</w:t>
+              <w:t>Elena Luchkina, Emily Yang &amp; Sandra Waxman</w:t>
             </w:r>
           </w:p>
           <w:p>

</xml_diff>

<commit_message>
QR cards: add author affiliations; verified via render + QR decode
Co-Authored-By: Claude Opus 4.8 <noreply@anthropic.com>
</commit_message>
<xml_diff>
--- a/ICIS2026_QR_Scan_Cards.docx
+++ b/ICIS2026_QR_Scan_Cards.docx
@@ -174,7 +174,7 @@
           </w:p>
           <w:p>
             <w:pPr>
-              <w:spacing w:before="40" w:after="40"/>
+              <w:spacing w:before="40" w:after="20"/>
               <w:jc w:val="center"/>
             </w:pPr>
             <w:r>
@@ -190,7 +190,7 @@
           </w:p>
           <w:p>
             <w:pPr>
-              <w:spacing w:before="40" w:after="40"/>
+              <w:spacing w:before="0" w:after="40"/>
               <w:jc w:val="center"/>
             </w:pPr>
             <w:r>
@@ -199,9 +199,9 @@
                 <w:b w:val="0"/>
                 <w:i w:val="0"/>
                 <w:color w:val="777777"/>
-                <w:sz w:val="20"/>
+                <w:sz w:val="19"/>
               </w:rPr>
-              <w:t>Early Cognition and Communication Lab  ·  The University of Texas at Dallas</w:t>
+              <w:t>The University of Texas at Dallas  ·  Harvard University</w:t>
             </w:r>
           </w:p>
         </w:tc>
@@ -384,7 +384,7 @@
           </w:p>
           <w:p>
             <w:pPr>
-              <w:spacing w:before="40" w:after="40"/>
+              <w:spacing w:before="40" w:after="20"/>
               <w:jc w:val="center"/>
             </w:pPr>
             <w:r>
@@ -400,7 +400,7 @@
           </w:p>
           <w:p>
             <w:pPr>
-              <w:spacing w:before="40" w:after="40"/>
+              <w:spacing w:before="0" w:after="40"/>
               <w:jc w:val="center"/>
             </w:pPr>
             <w:r>
@@ -409,9 +409,9 @@
                 <w:b w:val="0"/>
                 <w:i w:val="0"/>
                 <w:color w:val="777777"/>
-                <w:sz w:val="20"/>
+                <w:sz w:val="19"/>
               </w:rPr>
-              <w:t>Early Cognition and Communication Lab  ·  The University of Texas at Dallas</w:t>
+              <w:t>The University of Texas at Dallas  ·  Northwestern University</w:t>
             </w:r>
           </w:p>
         </w:tc>

</xml_diff>

<commit_message>
Remove em-dashes from all content; cleaner solid rules on QR cards
Co-Authored-By: Claude Opus 4.8 <noreply@anthropic.com>
</commit_message>
<xml_diff>
--- a/ICIS2026_QR_Scan_Cards.docx
+++ b/ICIS2026_QR_Scan_Cards.docx
@@ -57,16 +57,17 @@
           <w:p>
             <w:pPr>
               <w:spacing w:before="40" w:after="200"/>
+              <w:ind w:left="2835" w:right="2835"/>
               <w:jc w:val="center"/>
+              <w:pBdr>
+                <w:bottom w:val="single" w:sz="28" w:space="1" w:color="E87500"/>
+              </w:pBdr>
             </w:pPr>
             <w:r>
               <w:rPr>
-                <w:rFonts w:ascii="Arial" w:hAnsi="Arial"/>
-                <w:b/>
-                <w:color w:val="E87500"/>
-                <w:sz w:val="48"/>
+                <w:sz w:val="4"/>
               </w:rPr>
-              <w:t>————</w:t>
+              <w:t xml:space="preserve"> </w:t>
             </w:r>
           </w:p>
           <w:p>
@@ -138,7 +139,7 @@
                 <w:color w:val="333333"/>
                 <w:sz w:val="27"/>
               </w:rPr>
-              <w:t>Scan to leave a question — we'll follow up by email.</w:t>
+              <w:t>Scan to leave a question and we'll follow up by email.</w:t>
             </w:r>
           </w:p>
           <w:p>
@@ -160,16 +161,17 @@
           <w:p>
             <w:pPr>
               <w:spacing w:before="80" w:after="160"/>
+              <w:ind w:left="2835" w:right="2835"/>
               <w:jc w:val="center"/>
+              <w:pBdr>
+                <w:bottom w:val="single" w:sz="18" w:space="1" w:color="154734"/>
+              </w:pBdr>
             </w:pPr>
             <w:r>
               <w:rPr>
-                <w:rFonts w:ascii="Arial" w:hAnsi="Arial"/>
-                <w:b/>
-                <w:color w:val="154734"/>
-                <w:sz w:val="32"/>
+                <w:sz w:val="4"/>
               </w:rPr>
-              <w:t>————</w:t>
+              <w:t xml:space="preserve"> </w:t>
             </w:r>
           </w:p>
           <w:p>
@@ -267,16 +269,17 @@
           <w:p>
             <w:pPr>
               <w:spacing w:before="40" w:after="200"/>
+              <w:ind w:left="2835" w:right="2835"/>
               <w:jc w:val="center"/>
+              <w:pBdr>
+                <w:bottom w:val="single" w:sz="28" w:space="1" w:color="E87500"/>
+              </w:pBdr>
             </w:pPr>
             <w:r>
               <w:rPr>
-                <w:rFonts w:ascii="Arial" w:hAnsi="Arial"/>
-                <w:b/>
-                <w:color w:val="E87500"/>
-                <w:sz w:val="48"/>
+                <w:sz w:val="4"/>
               </w:rPr>
-              <w:t>————</w:t>
+              <w:t xml:space="preserve"> </w:t>
             </w:r>
           </w:p>
           <w:p>
@@ -370,16 +373,17 @@
           <w:p>
             <w:pPr>
               <w:spacing w:before="80" w:after="160"/>
+              <w:ind w:left="2835" w:right="2835"/>
               <w:jc w:val="center"/>
+              <w:pBdr>
+                <w:bottom w:val="single" w:sz="18" w:space="1" w:color="154734"/>
+              </w:pBdr>
             </w:pPr>
             <w:r>
               <w:rPr>
-                <w:rFonts w:ascii="Arial" w:hAnsi="Arial"/>
-                <w:b/>
-                <w:color w:val="154734"/>
-                <w:sz w:val="32"/>
+                <w:sz w:val="4"/>
               </w:rPr>
-              <w:t>————</w:t>
+              <w:t xml:space="preserve"> </w:t>
             </w:r>
           </w:p>
           <w:p>

</xml_diff>